<commit_message>
Justify rationale paragraphs and add PDF export
Co-Authored-By: Claude Opus 5.5 <noreply@anthropic.com>
Claude-Session: https://claude.ai/code/session_01QgvE9oWsttuXytVvCCjLqk
</commit_message>
<xml_diff>
--- a/docs/beauty-salon-crm/Rationale_IT13_Beauty_Salon_CRM.docx
+++ b/docs/beauty-salon-crm/Rationale_IT13_Beauty_Salon_CRM.docx
@@ -55,16 +55,25 @@
       </w:r>
     </w:p>
     <w:p>
+      <w:pPr>
+        <w:jc w:val="both"/>
+      </w:pPr>
       <w:r>
         <w:t>Beauty salons often face challenges in handling customer inquiries, keeping track of customer records and service history, processing payments, supervising staff, and monitoring sales. Because many salons still rely on paper logbooks, chat messages, and spreadsheets, these problems can lead to lost customer information, slow and inaccurate billing, unorganized staff assignments, delayed sales reports, and regular customers who stop returning without the business noticing.</w:t>
       </w:r>
     </w:p>
     <w:p>
+      <w:pPr>
+        <w:jc w:val="both"/>
+      </w:pPr>
       <w:r>
         <w:t>To address these challenges, the proposed Beauty Salon Customer Relationship Management (CRM) System, developed in C#, aims to integrate essential customer and business operations into one centralized platform. The system will have four user roles: Super Admin, Admin, Manager, and Staff. The Super Admin will manage admin accounts and salon subscriptions, the Admin will review sales reports, plan customer retention, manage staff, and oversee customer data collection, the Manager will also manage staff, prepare sales reports, and review customer feedback, while Staff will manage customer inquiries, entertain customers, and process payments. Customers will be served and recorded by the staff without needing to create accounts.</w:t>
       </w:r>
     </w:p>
     <w:p>
+      <w:pPr>
+        <w:jc w:val="both"/>
+      </w:pPr>
       <w:r>
         <w:t>Through this integrated system, the salon can maintain complete customer records, speed up front-desk transactions, produce accurate sales reports, act on customer feedback, and identify customers who need retention offers. Ultimately, the proposed system aims to enhance operational efficiency, support better decision-making, strengthen customer loyalty, and provide clients with a more personalized and reliable salon experience.</w:t>
       </w:r>

</xml_diff>

<commit_message>
Add Manage Services use case for Admin and Manager
Update the diagram, rationale paper, README and PlantUML source, and drop
the outdated oval diagram.

Co-Authored-By: Claude Opus 5.5 <noreply@anthropic.com>
Claude-Session: https://claude.ai/code/session_01QgvE9oWsttuXytVvCCjLqk
</commit_message>
<xml_diff>
--- a/docs/beauty-salon-crm/Rationale_IT13_Beauty_Salon_CRM.docx
+++ b/docs/beauty-salon-crm/Rationale_IT13_Beauty_Salon_CRM.docx
@@ -59,7 +59,7 @@
         <w:jc w:val="both"/>
       </w:pPr>
       <w:r>
-        <w:t>Beauty salons often face challenges in handling customer inquiries, keeping track of customer records and service history, processing payments, supervising staff, and monitoring sales. Because many salons still rely on paper logbooks, chat messages, and spreadsheets, these problems can lead to lost customer information, slow and inaccurate billing, unorganized staff assignments, delayed sales reports, and regular customers who stop returning without the business noticing.</w:t>
+        <w:t>Beauty salons often face challenges in handling customer inquiries, keeping track of customer records and service history, processing payments, supervising staff, and monitoring sales. Because many salons still rely on paper logbooks, chat messages, and spreadsheets, these problems can lead to lost customer information, slow and inaccurate billing, unorganized staff assignments, outdated service lists and prices, delayed sales reports, and regular customers who stop returning without the business noticing.</w:t>
       </w:r>
     </w:p>
     <w:p>
@@ -67,7 +67,7 @@
         <w:jc w:val="both"/>
       </w:pPr>
       <w:r>
-        <w:t>To address these challenges, the proposed Beauty Salon Customer Relationship Management (CRM) System, developed in C#, aims to integrate essential customer and business operations into one centralized platform. The system will have four user roles: Super Admin, Admin, Manager, and Staff. The Super Admin will manage admin accounts and salon subscriptions, the Admin will review sales reports, plan customer retention, manage staff, and oversee customer data collection, the Manager will also manage staff, prepare sales reports, and review customer feedback, while Staff will manage customer inquiries, entertain customers, and process payments. Customers will be served and recorded by the staff without needing to create accounts.</w:t>
+        <w:t>To address these challenges, the proposed Beauty Salon Customer Relationship Management (CRM) System, developed in C#, aims to integrate essential customer and business operations into one centralized platform. The system will have four user roles: Super Admin, Admin, Manager, and Staff. The Super Admin will manage admin accounts and salon subscriptions, the Admin will review sales reports, plan customer retention, manage staff and salon services, and oversee customer data collection, the Manager will also manage staff and services, prepare sales reports, and review customer feedback, while Staff will manage customer inquiries, entertain customers, and process payments. Customers will be served and recorded by the staff without needing to create accounts.</w:t>
       </w:r>
     </w:p>
     <w:p>
@@ -91,7 +91,7 @@
         <w:lastRenderedPageBreak/>
         <w:drawing>
           <wp:inline distT="0" distB="0" distL="0" distR="0" wp14:anchorId="32CD86CC" wp14:editId="14F040BD">
-            <wp:extent cx="5851709" cy="6729465"/>
+            <wp:extent cx="5851709" cy="7197602"/>
             <wp:effectExtent l="0" t="0" r="0" b="0"/>
             <wp:docPr id="1" name="Picture 1"/>
             <wp:cNvGraphicFramePr>
@@ -113,7 +113,7 @@
                   <pic:spPr>
                     <a:xfrm>
                       <a:off x="0" y="0"/>
-                      <a:ext cx="5851709" cy="6729465"/>
+                      <a:ext cx="5851709" cy="7197602"/>
                     </a:xfrm>
                     <a:prstGeom prst="rect">
                       <a:avLst/>

</xml_diff>